<commit_message>
fix(inversiones): en la cesión de sociedad el monto del crédito sigue en la misma línea
La viñeta de cada crédito estaba partida en dos párrafos: el primero terminaba
en "por un monto capital de" y el monto arrancaba en el siguiente, así que
siempre se bajaba de renglón. Queda en un solo párrafo, como en la cesión
individual, en hombre y mujer.

Co-Authored-By: Claude Opus 5.5 <noreply@anthropic.com>
</commit_message>
<xml_diff>
--- a/apps/legal-docs-blueprints/templates/inversiones_Sociedad/cesion_creditos/cestion_creditos_hombre.docx
+++ b/apps/legal-docs-blueprints/templates/inversiones_Sociedad/cesion_creditos/cestion_creditos_hombre.docx
@@ -1091,43 +1091,8 @@
           <w:vertAlign w:val="baseline"/>
           <w:rtl w:val="0"/>
         </w:rPr>
-        <w:t xml:space="preserve">por  un monto capital  de</w:t>
-      </w:r>
-    </w:p>
-    <w:p>
-      <w:pPr>
-        <w:keepNext w:val="0"/>
-        <w:keepLines w:val="0"/>
-        <w:pageBreakBefore w:val="0"/>
-        <w:widowControl w:val="0"/>
-        <w:pBdr>
-          <w:top w:space="0" w:sz="0" w:val="nil"/>
-          <w:left w:space="0" w:sz="0" w:val="nil"/>
-          <w:bottom w:space="0" w:sz="0" w:val="nil"/>
-          <w:right w:space="0" w:sz="0" w:val="nil"/>
-          <w:between w:space="0" w:sz="0" w:val="nil"/>
-        </w:pBdr>
-        <w:shd w:fill="auto" w:val="clear"/>
-        <w:tabs>
-          <w:tab w:val="left" w:leader="none" w:pos="2911"/>
-          <w:tab w:val="left" w:leader="none" w:pos="3664"/>
-          <w:tab w:val="left" w:leader="none" w:pos="4225"/>
-          <w:tab w:val="left" w:leader="none" w:pos="8139"/>
-        </w:tabs>
-        <w:spacing w:after="0" w:before="37" w:line="283" w:lineRule="auto"/>
-        <w:ind w:left="980" w:right="254" w:firstLine="0"/>
-        <w:jc w:val="both"/>
-        <w:rPr>
-          <w:i w:val="0"/>
-          <w:iCs w:val="0"/>
-          <w:smallCaps w:val="0"/>
-          <w:strike w:val="0"/>
-          <w:color w:val="000000"/>
-          <w:u w:val="none"/>
-          <w:shd w:fill="auto" w:val="clear"/>
-          <w:vertAlign w:val="baseline"/>
-        </w:rPr>
-      </w:pPr>
+        <w:t xml:space="preserve">por  un monto capital  de </w:t>
+      </w:r>
       <w:r>
         <w:rPr>
           <w:i w:val="0"/>

</xml_diff>